<commit_message>
agregamos vistas de ordenes, reportes y perfil del administrador y adjuntamos los documentos actualisados
</commit_message>
<xml_diff>
--- a/Especificacion de Requisitos de Software (ERS).docx
+++ b/Especificacion de Requisitos de Software (ERS).docx
@@ -1,423 +1,281 @@
 
-<file path=word\document.xml><?xml version="1.0" encoding="utf-8"?>
-<w:document xmlns:mc="http://schemas.openxmlformats.org/markup-compatibility/2006" xmlns:o="urn:schemas-microsoft-com:office:office" xmlns:r="http://schemas.openxmlformats.org/officeDocument/2006/relationships" xmlns:m="http://schemas.openxmlformats.org/officeDocument/2006/math" xmlns:v="urn:schemas-microsoft-com:vml" xmlns:wp="http://schemas.openxmlformats.org/drawingml/2006/wordprocessingDrawing" xmlns:w10="urn:schemas-microsoft-com:office:word" xmlns:w="http://schemas.openxmlformats.org/wordprocessingml/2006/main" xmlns:wne="http://schemas.microsoft.com/office/word/2006/wordml" xmlns:sl="http://schemas.openxmlformats.org/schemaLibrary/2006/main" xmlns:a="http://schemas.openxmlformats.org/drawingml/2006/main" xmlns:pic="http://schemas.openxmlformats.org/drawingml/2006/picture" xmlns:c="http://schemas.openxmlformats.org/drawingml/2006/chart" xmlns:lc="http://schemas.openxmlformats.org/drawingml/2006/lockedCanvas" xmlns:dgm="http://schemas.openxmlformats.org/drawingml/2006/diagram" xmlns:wps="http://schemas.microsoft.com/office/word/2010/wordprocessingShape" xmlns:wpg="http://schemas.microsoft.com/office/word/2010/wordprocessingGroup" xmlns:w14="http://schemas.microsoft.com/office/word/2010/wordml" xmlns:w15="http://schemas.microsoft.com/office/word/2012/wordml" xmlns:w16="http://schemas.microsoft.com/office/word/2018/wordml" xmlns:w16cex="http://schemas.microsoft.com/office/word/2018/wordml/cex" xmlns:w16cid="http://schemas.microsoft.com/office/word/2016/wordml/cid" xmlns="http://schemas.microsoft.com/office/tasks/2019/documenttasks" xmlns:cr="http://schemas.microsoft.com/office/comments/2020/reactions">
+<file path=word/document.xml><?xml version="1.0" encoding="utf-8"?>
+<w:document xmlns:w="http://schemas.openxmlformats.org/wordprocessingml/2006/main">
   <w:body>
     <w:p>
       <w:pPr>
-        <w:pStyle w:val="Heading1"/>
-        <w:rPr>
-          <w:sz w:val="44"/>
-          <w:szCs w:val="44"/>
-        </w:rPr>
-      </w:pPr>
-      <w:r>
-        <w:rPr>
-          <w:sz w:val="44"/>
-          <w:szCs w:val="44"/>
-        </w:rPr>
-        <w:t xml:space="preserve">Especificación de Requisitos de Software (ERS) - Versión 2.0</w:t>
-      </w:r>
-    </w:p>
-    <w:p>
-      <w:pPr>
-        <w:pStyle w:val="Heading2"/>
-        <w:spacing w:after="120"/>
-        <w:rPr>
+        <w:spacing w:after="120"/>
+      </w:pPr>
+      <w:r>
+        <w:rPr>
+          <w:b/>
+          <w:color w:val="2E7D32"/>
           <w:sz w:val="32"/>
           <w:szCs w:val="32"/>
         </w:rPr>
-      </w:pPr>
-      <w:r>
-        <w:rPr>
-          <w:sz w:val="32"/>
-          <w:szCs w:val="32"/>
-        </w:rPr>
-        <w:t xml:space="preserve">Proyecto: Almacén Cecilia - Tienda Online en React (Evaluación Parcial N° 2 - DSY1104)</w:t>
-      </w:r>
-    </w:p>
-    <w:p>
-      <w:pPr>
-        <w:spacing w:after="200"/>
-      </w:pPr>
-      <w:r>
-        <w:t xml:space="preserve">Integrantes: Alvaro Ramirez y Fernando Reyes | Institución: Duoc UC | Asignatura: Desarrollo Full Stack II (DSY1104)</w:t>
-      </w:r>
-    </w:p>
-    <w:p>
-      <w:pPr>
-        <w:pStyle w:val="Heading3"/>
-        <w:rPr>
-          <w:color w:val="000000"/>
+        <w:t xml:space="preserve">Especificación de Requisitos de Software (ERS)</w:t>
+      </w:r>
+    </w:p>
+    <w:p>
+      <w:pPr>
+        <w:spacing w:after="120"/>
+      </w:pPr>
+      <w:r>
+        <w:rPr>
+          <w:b/>
+          <w:sz w:val="24"/>
+          <w:szCs w:val="24"/>
+        </w:rPr>
+        <w:t xml:space="preserve">Proyecto: Almacén Cecilia - Tienda Online (Entrega 2 - React)</w:t>
+      </w:r>
+    </w:p>
+    <w:p>
+      <w:pPr>
+        <w:spacing w:after="120"/>
+      </w:pPr>
+      <w:r>
+        <w:rPr>
+          <w:sz w:val="20"/>
+          <w:szCs w:val="20"/>
+        </w:rPr>
+        <w:t xml:space="preserve">Integrantes: Alvaro Ramirez y Fernando Reyes | Asignatura: DSY1104 - Duoc UC</w:t>
+      </w:r>
+    </w:p>
+    <w:p>
+      <w:pPr>
+        <w:spacing w:after="120"/>
+      </w:pPr>
+      <w:r>
+        <w:rPr>
+          <w:b/>
+          <w:color w:val="2E7D32"/>
           <w:sz w:val="26"/>
           <w:szCs w:val="26"/>
         </w:rPr>
-      </w:pPr>
-      <w:r>
-        <w:rPr>
-          <w:color w:val="000000"/>
+        <w:t xml:space="preserve">1. Introducción y Propósito</w:t>
+      </w:r>
+    </w:p>
+    <w:p>
+      <w:pPr>
+        <w:spacing w:after="120"/>
+      </w:pPr>
+      <w:r>
+        <w:t xml:space="preserve">El objetivo de este proyecto es continuar el desarrollo del sitio web para el emprendimiento de barrio "Almacén Cecilia". Para esta segunda entrega, migramos las páginas HTML estáticas de la evaluación anterior hacia React con Bootstrap 5, agregando las vistas nuevas pedidas en la guía (Categorías, Ofertas, Checkout de compra y Panel de Administrador), guardando los datos en localStorage y sumando pruebas unitarias con Jasmine y Karma.</w:t>
+      </w:r>
+    </w:p>
+    <w:p>
+      <w:pPr>
+        <w:spacing w:after="120"/>
+      </w:pPr>
+      <w:r>
+        <w:rPr>
+          <w:b/>
+          <w:color w:val="2E7D32"/>
           <w:sz w:val="26"/>
           <w:szCs w:val="26"/>
         </w:rPr>
-        <w:t xml:space="preserve">1. Introducción y Propósito (Actualización V2)</w:t>
-      </w:r>
-    </w:p>
-    <w:p>
-      <w:pPr>
-        <w:spacing w:after="240"/>
-      </w:pPr>
-      <w:r>
-        <w:t xml:space="preserve">La versión 2.0 del proyecto "Almacén Cecilia" migra el prototipo original de la Evaluación Parcial 1 hacia una aplicación web de página única (SPA) desarrollada con React 19, Vite, React Router DOM 7 y Bootstrap 5.3.3. Incorpora gestión de estado reactivo mediante Context API, persistencia completa en LocalStorage (catálogo, carrito, usuarios registrados, sesión activa y órdenes de compra), protección de rutas administrativas por rol y pruebas unitarias automatizadas con Jasmine y Karma superando el 80% de cobertura sobre todo el código fuente (src/).</w:t>
-      </w:r>
-    </w:p>
-    <w:p>
-      <w:pPr>
-        <w:pStyle w:val="Heading3"/>
-        <w:rPr>
-          <w:color w:val="000000"/>
+        <w:t xml:space="preserve">2. Actores (Usuarios del Sistema)</w:t>
+      </w:r>
+    </w:p>
+    <w:p>
+      <w:pPr>
+        <w:spacing w:after="120"/>
+      </w:pPr>
+      <w:r>
+        <w:t xml:space="preserve">Cliente / Visitante: Persona que navega por la tienda, busca productos, filtra por categorías u ofertas, arma su carrito de compras, envía consultas en el formulario de contacto, se registra o inicia sesión y realiza el pago de su pedido.</w:t>
+      </w:r>
+    </w:p>
+    <w:p>
+      <w:pPr>
+        <w:spacing w:after="120"/>
+      </w:pPr>
+      <w:r>
+        <w:t xml:space="preserve">Vendedor: Usuario con permiso para entrar al panel de administración a revisar el inventario, ver productos con stock crítico y consultar las boletas.</w:t>
+      </w:r>
+    </w:p>
+    <w:p>
+      <w:pPr>
+        <w:spacing w:after="120"/>
+      </w:pPr>
+      <w:r>
+        <w:t xml:space="preserve">Administrador: Encargado del almacén que tiene acceso completo al panel de administración (/admin) para agregar, editar o eliminar productos, crear categorías, gestionar usuarios y ver los reportes de ventas.</w:t>
+      </w:r>
+    </w:p>
+    <w:p>
+      <w:pPr>
+        <w:spacing w:after="120"/>
+      </w:pPr>
+      <w:r>
+        <w:rPr>
+          <w:b/>
+          <w:color w:val="2E7D32"/>
           <w:sz w:val="26"/>
           <w:szCs w:val="26"/>
         </w:rPr>
-      </w:pPr>
-      <w:r>
-        <w:rPr>
-          <w:color w:val="000000"/>
+        <w:t xml:space="preserve">3. Requisitos Funcionales (RF)</w:t>
+      </w:r>
+    </w:p>
+    <w:p>
+      <w:pPr>
+        <w:spacing w:after="120"/>
+      </w:pPr>
+      <w:r>
+        <w:rPr>
+          <w:b/>
+        </w:rPr>
+        <w:t xml:space="preserve">RF01 - Portada, Navegación y Nosotros:</w:t>
+      </w:r>
+    </w:p>
+    <w:p>
+      <w:pPr>
+        <w:spacing w:after="120"/>
+      </w:pPr>
+      <w:r>
+        <w:t xml:space="preserve">El sistema cuenta con una página de inicio (Home) que incluye el carrusel promocional, el video de YouTube del almacén, productos destacados y preguntas frecuentes. La barra de navegación permite moverse entre todas las páginas sin recargar el sitio y muestra la cantidad de productos en el carrito. También incluye la vista Nosotros con la historia del negocio y los integrantes del equipo, además de una sección de Blog.</w:t>
+      </w:r>
+    </w:p>
+    <w:p>
+      <w:pPr>
+        <w:spacing w:after="120"/>
+      </w:pPr>
+      <w:r>
+        <w:rPr>
+          <w:b/>
+        </w:rPr>
+        <w:t xml:space="preserve">RF02 - Catálogo, Categorías, Ofertas y Detalle de Producto:</w:t>
+      </w:r>
+    </w:p>
+    <w:p>
+      <w:pPr>
+        <w:spacing w:after="120"/>
+      </w:pPr>
+      <w:r>
+        <w:t xml:space="preserve">El sistema muestra los productos mediante el componente reutilizable ProductoCard con su imagen, nombre, categoría y precio. Permite buscar por nombre, separar los productos por categoría (/categorias), ver solo los que tienen descuento (/ofertas) y entrar al detalle de cada producto (/productos/:id) para ver su descripción y stock disponible.</w:t>
+      </w:r>
+    </w:p>
+    <w:p>
+      <w:pPr>
+        <w:spacing w:after="120"/>
+      </w:pPr>
+      <w:r>
+        <w:rPr>
+          <w:b/>
+        </w:rPr>
+        <w:t xml:space="preserve">RF03 - Carrito de Compras y Proceso de Compra (Checkout):</w:t>
+      </w:r>
+    </w:p>
+    <w:p>
+      <w:pPr>
+        <w:spacing w:after="120"/>
+      </w:pPr>
+      <w:r>
+        <w:t xml:space="preserve">El carrito guarda los productos seleccionados en localStorage para que no se borren al recargar la página. Permite subir o bajar la cantidad de unidades, eliminar ítems y vaciar el carrito confirmando en una ventana modal. Al pasar a la compra (/compra), el cliente ingresa sus datos y dirección eligiendo Región y Comuna (si ya inició sesión se rellenan su nombre y correo). Al confirmar, se guarda la boleta y se muestra la vista de compra exitosa (/compra/ok) o la vista de error de pago (/compra/error).</w:t>
+      </w:r>
+    </w:p>
+    <w:p>
+      <w:pPr>
+        <w:spacing w:after="120"/>
+      </w:pPr>
+      <w:r>
+        <w:rPr>
+          <w:b/>
+        </w:rPr>
+        <w:t xml:space="preserve">RF04 - Formulario de Contacto y Validaciones:</w:t>
+      </w:r>
+    </w:p>
+    <w:p>
+      <w:pPr>
+        <w:spacing w:after="120"/>
+      </w:pPr>
+      <w:r>
+        <w:t xml:space="preserve">El formulario de contacto solicita Nombre, RUT, Correo Electrónico y Mensaje, validando los campos en tiempo real con React. Se valida que el RUT sea válido según el algoritmo Módulo 11 y que el correo pertenezca solo a @gmail.com, @duoc.cl o @profesor.duoc.cl.</w:t>
+      </w:r>
+    </w:p>
+    <w:p>
+      <w:pPr>
+        <w:spacing w:after="120"/>
+      </w:pPr>
+      <w:r>
+        <w:rPr>
+          <w:b/>
+        </w:rPr>
+        <w:t xml:space="preserve">RF05 - Inicio de Sesión y Registro de Usuarios:</w:t>
+      </w:r>
+    </w:p>
+    <w:p>
+      <w:pPr>
+        <w:spacing w:after="120"/>
+      </w:pPr>
+      <w:r>
+        <w:t xml:space="preserve">El formulario de Login valida el correo y que la contraseña tenga entre 4 y 10 caracteres, verificando los datos contra los usuarios guardados en localStorage. El formulario de Registro valida el RUN chileno, la selección de Región y Comuna y que ambas contraseñas coincidan. Además se incluyeron botones de acceso rápido en el login para probar las vistas de Cliente, Vendedor y Administrador.</w:t>
+      </w:r>
+    </w:p>
+    <w:p>
+      <w:pPr>
+        <w:spacing w:after="120"/>
+      </w:pPr>
+      <w:r>
+        <w:rPr>
+          <w:b/>
+        </w:rPr>
+        <w:t xml:space="preserve">RF06 - Panel de Administración (/admin):</w:t>
+      </w:r>
+    </w:p>
+    <w:p>
+      <w:pPr>
+        <w:spacing w:after="120"/>
+      </w:pPr>
+      <w:r>
+        <w:t xml:space="preserve">El panel administrativo cuenta con un Dashboard general, listado y formulario de Productos (validando código mínimo de 3 caracteres, nombre, precio, categoría, stock y mostrando una alerta cuando el stock es menor o igual al stock crítico), además de las secciones de Categorías, Órdenes/Boletas, Usuarios, Reportes y Perfil.</w:t>
+      </w:r>
+    </w:p>
+    <w:p>
+      <w:pPr>
+        <w:spacing w:after="120"/>
+      </w:pPr>
+      <w:r>
+        <w:rPr>
+          <w:b/>
+          <w:color w:val="2E7D32"/>
           <w:sz w:val="26"/>
           <w:szCs w:val="26"/>
         </w:rPr>
-        <w:t xml:space="preserve">2. Actores (Usuarios del Sistema)</w:t>
-      </w:r>
-    </w:p>
-    <w:p>
-      <w:pPr>
-        <w:numPr>
-          <w:ilvl w:val="0"/>
-          <w:numId w:val="1"/>
-        </w:numPr>
-        <w:ind w:left="720" w:hanging="360"/>
-      </w:pPr>
-      <w:r>
-        <w:t xml:space="preserve">Cliente / Vecino (Rol 3): Navega por el catálogo, filtra por categorías u ofertas, gestiona su carrito de compras, se registra e inicia sesión, y realiza el proceso de checkout generando boletas electrónicas.</w:t>
-      </w:r>
-    </w:p>
-    <w:p>
-      <w:pPr>
-        <w:numPr>
-          <w:ilvl w:val="0"/>
-          <w:numId w:val="1"/>
-        </w:numPr>
-        <w:ind w:left="720" w:hanging="360"/>
-      </w:pPr>
-      <w:r>
-        <w:t xml:space="preserve">Vendedor (Rol 2): Usuario autenticado con acceso autorizado al panel administrativo para consultar inventario, revisar órdenes/boletas y verificar stock crítico.</w:t>
-      </w:r>
-    </w:p>
-    <w:p>
-      <w:pPr>
-        <w:numPr>
-          <w:ilvl w:val="0"/>
-          <w:numId w:val="1"/>
-        </w:numPr>
-        <w:spacing w:after="240"/>
-        <w:ind w:left="720" w:hanging="360"/>
-      </w:pPr>
-      <w:r>
-        <w:t xml:space="preserve">Administrador (Rol 1): Encargado principal del almacén con acceso total al Dashboard (/admin), CRUD de productos, gestión de categorías, órdenes y boletas, administración de usuarios e historial de compras, reportes ejecutivos y edición de perfil.</w:t>
-      </w:r>
-    </w:p>
-    <w:p>
-      <w:pPr>
-        <w:pStyle w:val="Heading3"/>
-        <w:rPr>
-          <w:color w:val="000000"/>
-          <w:sz w:val="26"/>
-          <w:szCs w:val="26"/>
-        </w:rPr>
-      </w:pPr>
-      <w:r>
-        <w:rPr>
-          <w:color w:val="000000"/>
-          <w:sz w:val="26"/>
-          <w:szCs w:val="26"/>
-        </w:rPr>
-        <w:t xml:space="preserve">3. Requisitos Funcionales (RF - Versión 2.0)</w:t>
-      </w:r>
-    </w:p>
-    <w:p>
-      <w:pPr>
-        <w:numPr>
-          <w:ilvl w:val="0"/>
-          <w:numId w:val="2"/>
-        </w:numPr>
-        <w:ind w:left="720" w:hanging="360"/>
-      </w:pPr>
-      <w:r>
-        <w:t xml:space="preserve">RF01 - Portada, Navegación Reactiva e Información Institucional:</w:t>
-      </w:r>
-    </w:p>
-    <w:p>
-      <w:pPr>
-        <w:numPr>
-          <w:ilvl w:val="1"/>
-          <w:numId w:val="2"/>
-        </w:numPr>
-        <w:ind w:left="1440" w:hanging="360"/>
-      </w:pPr>
-      <w:r>
-        <w:t xml:space="preserve">La vista Home (/) incluye carrusel interactivo en React, video promocional responsivo (ratio 16x9), listado de productos destacados y acordeón de preguntas frecuentes.</w:t>
-      </w:r>
-    </w:p>
-    <w:p>
-      <w:pPr>
-        <w:numPr>
-          <w:ilvl w:val="1"/>
-          <w:numId w:val="2"/>
-        </w:numPr>
-        <w:ind w:left="1440" w:hanging="360"/>
-      </w:pPr>
-      <w:r>
-        <w:t xml:space="preserve">La barra Navbar muestra dinámicamente el contador del carrito, el menú lateral de categorías (Offcanvas), el nombre del usuario con sesión activa, botón de cierre de sesión y acceso al panel Admin según rol.</w:t>
-      </w:r>
-    </w:p>
-    <w:p>
-      <w:pPr>
-        <w:numPr>
-          <w:ilvl w:val="0"/>
-          <w:numId w:val="2"/>
-        </w:numPr>
-        <w:ind w:left="720" w:hanging="360"/>
-      </w:pPr>
-      <w:r>
-        <w:t xml:space="preserve">RF02 - Catálogo Reactivo, Categorías, Ofertas y Detalle de Producto:</w:t>
-      </w:r>
-    </w:p>
-    <w:p>
-      <w:pPr>
-        <w:numPr>
-          <w:ilvl w:val="1"/>
-          <w:numId w:val="2"/>
-        </w:numPr>
-        <w:ind w:left="1440" w:hanging="360"/>
-      </w:pPr>
-      <w:r>
-        <w:t xml:space="preserve">El sistema permite buscar productos por texto, filtrar por categoría (/productos y /categorias), consultar productos con descuento (/ofertas) y visualizar la ficha completa (/productos/:id) con migas de pan (Breadcrumb) y productos relacionados.</w:t>
-      </w:r>
-    </w:p>
-    <w:p>
-      <w:pPr>
-        <w:numPr>
-          <w:ilvl w:val="1"/>
-          <w:numId w:val="2"/>
-        </w:numPr>
-        <w:ind w:left="1440" w:hanging="360"/>
-      </w:pPr>
-      <w:r>
-        <w:t xml:space="preserve">Cada tarjeta ProductoCard calcula el porcentaje de descuento, alerta cuando el stock es crítico y bloquea la compra si el producto está agotado.</w:t>
-      </w:r>
-    </w:p>
-    <w:p>
-      <w:pPr>
-        <w:numPr>
-          <w:ilvl w:val="0"/>
-          <w:numId w:val="2"/>
-        </w:numPr>
-        <w:ind w:left="720" w:hanging="360"/>
-      </w:pPr>
-      <w:r>
-        <w:t xml:space="preserve">RF03 - Carrito de Compras Persistente y Proceso de Checkout (/compra):</w:t>
-      </w:r>
-    </w:p>
-    <w:p>
-      <w:pPr>
-        <w:numPr>
-          <w:ilvl w:val="1"/>
-          <w:numId w:val="2"/>
-        </w:numPr>
-        <w:ind w:left="1440" w:hanging="360"/>
-      </w:pPr>
-      <w:r>
-        <w:t xml:space="preserve">El carrito persiste en localStorage (clave "carrito"), permitiendo agregar unidades sin superar el stock disponible, incrementar/disminuir cantidades, eliminar ítems y vaciar el carrito mediante modal de confirmación.</w:t>
-      </w:r>
-    </w:p>
-    <w:p>
-      <w:pPr>
-        <w:numPr>
-          <w:ilvl w:val="1"/>
-          <w:numId w:val="2"/>
-        </w:numPr>
-        <w:ind w:left="1440" w:hanging="360"/>
-      </w:pPr>
-      <w:r>
-        <w:t xml:space="preserve">La vista /compra valida los datos del comprador y dirección de despacho (Región y Comuna dependientes), registra la orden en localStorage ("ordenes_almacen"), vacía el carrito y redirige a /compra/ok (o /compra/error en simulación de fallo).</w:t>
-      </w:r>
-    </w:p>
-    <w:p>
-      <w:pPr>
-        <w:numPr>
-          <w:ilvl w:val="0"/>
-          <w:numId w:val="2"/>
-        </w:numPr>
-        <w:ind w:left="720" w:hanging="360"/>
-      </w:pPr>
-      <w:r>
-        <w:t xml:space="preserve">RF04 - Contacto y Blog Comunitario:</w:t>
-      </w:r>
-    </w:p>
-    <w:p>
-      <w:pPr>
-        <w:numPr>
-          <w:ilvl w:val="1"/>
-          <w:numId w:val="2"/>
-        </w:numPr>
-        <w:ind w:left="1440" w:hanging="360"/>
-      </w:pPr>
-      <w:r>
-        <w:t xml:space="preserve">El formulario de contacto (/contacto) valida en tiempo real Nombre, RUT chileno (Módulo 11), Correo (@duoc.cl, @profesor.duoc.cl o @gmail.com) y Mensaje. La vista /blog permite desplegar noticias y consejos del almacén.</w:t>
-      </w:r>
-    </w:p>
-    <w:p>
-      <w:pPr>
-        <w:numPr>
-          <w:ilvl w:val="0"/>
-          <w:numId w:val="2"/>
-        </w:numPr>
-        <w:ind w:left="720" w:hanging="360"/>
-      </w:pPr>
-      <w:r>
-        <w:t xml:space="preserve">RF05 - Autenticación Real, Registro de Usuarios y Control de Sesión:</w:t>
-      </w:r>
-    </w:p>
-    <w:p>
-      <w:pPr>
-        <w:numPr>
-          <w:ilvl w:val="1"/>
-          <w:numId w:val="2"/>
-        </w:numPr>
-        <w:ind w:left="1440" w:hanging="360"/>
-      </w:pPr>
-      <w:r>
-        <w:t xml:space="preserve">El formulario de Registro (/registro) valida RUN chileno, correo institucional/Gmail, región/comuna y coincidencia de contraseñas, guardando al nuevo usuario en localStorage ("usuarios_almacen") e iniciando su sesión.</w:t>
-      </w:r>
-    </w:p>
-    <w:p>
-      <w:pPr>
-        <w:numPr>
-          <w:ilvl w:val="1"/>
-          <w:numId w:val="2"/>
-        </w:numPr>
-        <w:ind w:left="1440" w:hanging="360"/>
-      </w:pPr>
-      <w:r>
-        <w:t xml:space="preserve">El formulario de Login (/login) verifica las credenciales contra los usuarios registrados en localStorage, almacena la sesión activa ("sesion_almacen") y redirige según el rol del usuario.</w:t>
-      </w:r>
-    </w:p>
-    <w:p>
-      <w:pPr>
-        <w:numPr>
-          <w:ilvl w:val="0"/>
-          <w:numId w:val="2"/>
-        </w:numPr>
-        <w:ind w:left="720" w:hanging="360"/>
-      </w:pPr>
-      <w:r>
-        <w:t xml:space="preserve">RF06 - Panel de Administración Protegido (/admin):</w:t>
-      </w:r>
-    </w:p>
-    <w:p>
-      <w:pPr>
-        <w:numPr>
-          <w:ilvl w:val="1"/>
-          <w:numId w:val="2"/>
-        </w:numPr>
-        <w:ind w:left="1440" w:hanging="360"/>
-      </w:pPr>
-      <w:r>
-        <w:t xml:space="preserve">El componente LayoutAdmin protege todas las rutas /admin/* verificando que exista una sesión activa con rol Administrador o Vendedor.</w:t>
-      </w:r>
-    </w:p>
-    <w:p>
-      <w:pPr>
-        <w:numPr>
-          <w:ilvl w:val="1"/>
-          <w:numId w:val="2"/>
-        </w:numPr>
-        <w:spacing w:after="240"/>
-        <w:ind w:left="1440" w:hanging="360"/>
-      </w:pPr>
-      <w:r>
-        <w:t xml:space="preserve">Incluye: Dashboard de métricas, CRUD completo de Productos con filtro de stock crítico, gestión de Categorías, módulo de Órdenes y Boletas electrónicas con cambio de estado, gestión de Usuarios con historial de compras, Reportes del sistema y Perfil del Administrador.</w:t>
-      </w:r>
-    </w:p>
-    <w:p>
-      <w:pPr>
-        <w:pStyle w:val="Heading3"/>
-        <w:rPr>
-          <w:color w:val="000000"/>
-          <w:sz w:val="26"/>
-          <w:szCs w:val="26"/>
-        </w:rPr>
-      </w:pPr>
-      <w:r>
-        <w:rPr>
-          <w:color w:val="000000"/>
-          <w:sz w:val="26"/>
-          <w:szCs w:val="26"/>
-        </w:rPr>
-        <w:t xml:space="preserve">4. Requisitos No Funcionales (RNF - Versión 2.0)</w:t>
-      </w:r>
-    </w:p>
-    <w:p>
-      <w:pPr>
-        <w:numPr>
-          <w:ilvl w:val="0"/>
-          <w:numId w:val="3"/>
-        </w:numPr>
-        <w:ind w:left="720" w:hanging="360"/>
-      </w:pPr>
-      <w:r>
-        <w:t xml:space="preserve">RNF01 - Stack Tecnológico: Aplicación construida con React 19, Vite 6, React Router DOM 7 y estilos responsivos con Bootstrap 5.3.3 más hoja de estilos institucional (estilos.css).</w:t>
-      </w:r>
-    </w:p>
-    <w:p>
-      <w:pPr>
-        <w:numPr>
-          <w:ilvl w:val="0"/>
-          <w:numId w:val="3"/>
-        </w:numPr>
-        <w:ind w:left="720" w:hanging="360"/>
-      </w:pPr>
-      <w:r>
-        <w:t xml:space="preserve">RNF02 - Persistencia Local: Uso estructurado de Web Storage API (localStorage) para mantener productos, categorías, carrito, usuarios, sesión activa y órdenes entre recargas del navegador.</w:t>
-      </w:r>
-    </w:p>
-    <w:p>
-      <w:pPr>
-        <w:numPr>
-          <w:ilvl w:val="0"/>
-          <w:numId w:val="3"/>
-        </w:numPr>
-        <w:spacing w:after="240"/>
-        <w:ind w:left="720" w:hanging="360"/>
-      </w:pPr>
-      <w:r>
-        <w:t xml:space="preserve">RNF03 - Calidad y Pruebas Unitarias (Testing): Suite automatizada de 10 pruebas unitarias implementada con Jasmine 5.13, Karma 6.4, ChromeHeadless e Istanbul (karma-coverage con includeAllSources: true), alcanzando 81.60% de cobertura de sentencias y 83.02% de cobertura de líneas sobre el total de archivos en src/.</w:t>
+        <w:t xml:space="preserve">4. Requisitos No Funcionales (RNF)</w:t>
+      </w:r>
+    </w:p>
+    <w:p>
+      <w:pPr>
+        <w:spacing w:after="120"/>
+      </w:pPr>
+      <w:r>
+        <w:t xml:space="preserve">RNF01 - Tecnologías y Componentes React: El frontend fue desarrollado con React 19, Vite y React Router, dividiendo la interfaz en componentes reutilizables que manejan sus propios datos mediante props y estados (useState y useContext).</w:t>
+      </w:r>
+    </w:p>
+    <w:p>
+      <w:pPr>
+        <w:spacing w:after="120"/>
+      </w:pPr>
+      <w:r>
+        <w:t xml:space="preserve">RNF02 - Diseño Responsivo con Bootstrap: Se utilizó Bootstrap 5.3.3 junto con nuestra hoja de estilos (estilo.css) para que las grillas de productos, el menú desplegable y las tablas se adapten bien a celulares, tablets y computadores.</w:t>
+      </w:r>
+    </w:p>
+    <w:p>
+      <w:pPr>
+        <w:spacing w:after="120"/>
+      </w:pPr>
+      <w:r>
+        <w:t xml:space="preserve">RNF03 - Persistencia y Pruebas Unitarias: Los datos de productos, carrito, usuarios y órdenes se mantienen en localStorage. Además, el proyecto incluye 10 pruebas unitarias configuradas con Jasmine y Karma para comprobar el renderizado, props, estados, validaciones y eventos.</w:t>
       </w:r>
     </w:p>
     <w:sectPr>
-      <w:pgSz w:h="16834" w:w="11909" w:orient="portrait"/>
-      <w:pgMar w:bottom="1440" w:top="1440" w:left="1440" w:right="1440" w:header="720" w:footer="720"/>
-      <w:pgNumType w:start="1"/>
+      <w:pgSz w:w="12240" w:h="15840"/>
+      <w:pgMar w:top="1440" w:right="1440" w:bottom="1440" w:left="1440"/>
     </w:sectPr>
   </w:body>
 </w:document>
 </file>
 
-<file path=word\fontTable.xml><?xml version="1.0" encoding="utf-8"?>
-<w:fonts xmlns:mc="http://schemas.openxmlformats.org/markup-compatibility/2006" xmlns:o="urn:schemas-microsoft-com:office:office" xmlns:r="http://schemas.openxmlformats.org/officeDocument/2006/relationships" xmlns:m="http://schemas.openxmlformats.org/officeDocument/2006/math" xmlns:v="urn:schemas-microsoft-com:vml" xmlns:wp="http://schemas.openxmlformats.org/drawingml/2006/wordprocessingDrawing" xmlns:w10="urn:schemas-microsoft-com:office:word" xmlns:w="http://schemas.openxmlformats.org/wordprocessingml/2006/main" xmlns:wne="http://schemas.microsoft.com/office/word/2006/wordml" xmlns:sl="http://schemas.openxmlformats.org/schemaLibrary/2006/main" xmlns:a="http://schemas.openxmlformats.org/drawingml/2006/main" xmlns:pic="http://schemas.openxmlformats.org/drawingml/2006/picture" xmlns:c="http://schemas.openxmlformats.org/drawingml/2006/chart" xmlns:lc="http://schemas.openxmlformats.org/drawingml/2006/lockedCanvas" xmlns:dgm="http://schemas.openxmlformats.org/drawingml/2006/diagram" xmlns:wps="http://schemas.microsoft.com/office/word/2010/wordprocessingShape" xmlns:wpg="http://schemas.microsoft.com/office/word/2010/wordprocessingGroup" xmlns:w14="http://schemas.microsoft.com/office/word/2010/wordml" xmlns:w15="http://schemas.microsoft.com/office/word/2012/wordml" xmlns:w16="http://schemas.microsoft.com/office/word/2018/wordml" xmlns:w16cex="http://schemas.microsoft.com/office/word/2018/wordml/cex" xmlns:w16cid="http://schemas.microsoft.com/office/word/2016/wordml/cid" xmlns="http://schemas.microsoft.com/office/tasks/2019/documenttasks" xmlns:cr="http://schemas.microsoft.com/office/comments/2020/reactions">
-  <w:font w:name="Arial"/>
-</w:fonts>
-</file>
-
-<file path=word\numbering.xml><?xml version="1.0" encoding="utf-8"?>
+<file path=word/numbering.xml><?xml version="1.0" encoding="utf-8"?>
 <w:numbering xmlns:mc="http://schemas.openxmlformats.org/markup-compatibility/2006" xmlns:o="urn:schemas-microsoft-com:office:office" xmlns:r="http://schemas.openxmlformats.org/officeDocument/2006/relationships" xmlns:m="http://schemas.openxmlformats.org/officeDocument/2006/math" xmlns:v="urn:schemas-microsoft-com:vml" xmlns:wp="http://schemas.openxmlformats.org/drawingml/2006/wordprocessingDrawing" xmlns:w10="urn:schemas-microsoft-com:office:word" xmlns:w="http://schemas.openxmlformats.org/wordprocessingml/2006/main" xmlns:wne="http://schemas.microsoft.com/office/word/2006/wordml" xmlns:sl="http://schemas.openxmlformats.org/schemaLibrary/2006/main" xmlns:a="http://schemas.openxmlformats.org/drawingml/2006/main" xmlns:pic="http://schemas.openxmlformats.org/drawingml/2006/picture" xmlns:c="http://schemas.openxmlformats.org/drawingml/2006/chart" xmlns:lc="http://schemas.openxmlformats.org/drawingml/2006/lockedCanvas" xmlns:dgm="http://schemas.openxmlformats.org/drawingml/2006/diagram" xmlns:wps="http://schemas.microsoft.com/office/word/2010/wordprocessingShape" xmlns:wpg="http://schemas.microsoft.com/office/word/2010/wordprocessingGroup" xmlns:w14="http://schemas.microsoft.com/office/word/2010/wordml" xmlns:w15="http://schemas.microsoft.com/office/word/2012/wordml" xmlns:w16="http://schemas.microsoft.com/office/word/2018/wordml" xmlns:w16cex="http://schemas.microsoft.com/office/word/2018/wordml/cex" xmlns:w16cid="http://schemas.microsoft.com/office/word/2016/wordml/cid" xmlns="http://schemas.microsoft.com/office/tasks/2019/documenttasks" xmlns:cr="http://schemas.microsoft.com/office/comments/2020/reactions">
   <w:abstractNum w:abstractNumId="1">
     <w:lvl w:ilvl="0">
@@ -765,18 +623,7 @@
 </w:numbering>
 </file>
 
-<file path=word\settings.xml><?xml version="1.0" encoding="utf-8"?>
-<w:settings xmlns:mc="http://schemas.openxmlformats.org/markup-compatibility/2006" xmlns:o="urn:schemas-microsoft-com:office:office" xmlns:r="http://schemas.openxmlformats.org/officeDocument/2006/relationships" xmlns:m="http://schemas.openxmlformats.org/officeDocument/2006/math" xmlns:v="urn:schemas-microsoft-com:vml" xmlns:wp="http://schemas.openxmlformats.org/drawingml/2006/wordprocessingDrawing" xmlns:w10="urn:schemas-microsoft-com:office:word" xmlns:w="http://schemas.openxmlformats.org/wordprocessingml/2006/main" xmlns:wne="http://schemas.microsoft.com/office/word/2006/wordml" xmlns:sl="http://schemas.openxmlformats.org/schemaLibrary/2006/main" xmlns:a="http://schemas.openxmlformats.org/drawingml/2006/main" xmlns:pic="http://schemas.openxmlformats.org/drawingml/2006/picture" xmlns:c="http://schemas.openxmlformats.org/drawingml/2006/chart" xmlns:lc="http://schemas.openxmlformats.org/drawingml/2006/lockedCanvas" xmlns:dgm="http://schemas.openxmlformats.org/drawingml/2006/diagram" xmlns:wps="http://schemas.microsoft.com/office/word/2010/wordprocessingShape" xmlns:wpg="http://schemas.microsoft.com/office/word/2010/wordprocessingGroup" xmlns:w14="http://schemas.microsoft.com/office/word/2010/wordml" xmlns:w15="http://schemas.microsoft.com/office/word/2012/wordml" xmlns:w16="http://schemas.microsoft.com/office/word/2018/wordml" xmlns:w16cex="http://schemas.microsoft.com/office/word/2018/wordml/cex" xmlns:w16cid="http://schemas.microsoft.com/office/word/2016/wordml/cid" xmlns="http://schemas.microsoft.com/office/tasks/2019/documenttasks" xmlns:cr="http://schemas.microsoft.com/office/comments/2020/reactions">
-  <w:embedTrueTypeFonts w:val="1"/>
-  <w:defaultTabStop w:val="720"/>
-  <w:compat>
-    <w:compatSetting w:val="15" w:name="compatibilityMode" w:uri="http://schemas.microsoft.com/office/word"/>
-  </w:compat>
-  <w:clrSchemeMapping w:bg1="light1" w:t1="dark1" w:bg2="light2" w:t2="dark2" w:accent1="accent1" w:accent2="accent2" w:accent3="accent3" w:accent4="accent4" w:accent5="accent5" w:accent6="accent6" w:hyperlink="hyperlink" w:followedHyperlink="followedHyperlink"/>
-</w:settings>
-</file>
-
-<file path=word\styles.xml><?xml version="1.0" encoding="utf-8"?>
+<file path=word/styles.xml><?xml version="1.0" encoding="utf-8"?>
 <w:styles xmlns:mc="http://schemas.openxmlformats.org/markup-compatibility/2006" xmlns:o="urn:schemas-microsoft-com:office:office" xmlns:r="http://schemas.openxmlformats.org/officeDocument/2006/relationships" xmlns:m="http://schemas.openxmlformats.org/officeDocument/2006/math" xmlns:v="urn:schemas-microsoft-com:vml" xmlns:wp="http://schemas.openxmlformats.org/drawingml/2006/wordprocessingDrawing" xmlns:w10="urn:schemas-microsoft-com:office:word" xmlns:w="http://schemas.openxmlformats.org/wordprocessingml/2006/main" xmlns:wne="http://schemas.microsoft.com/office/word/2006/wordml" xmlns:sl="http://schemas.openxmlformats.org/schemaLibrary/2006/main" xmlns:a="http://schemas.openxmlformats.org/drawingml/2006/main" xmlns:pic="http://schemas.openxmlformats.org/drawingml/2006/picture" xmlns:c="http://schemas.openxmlformats.org/drawingml/2006/chart" xmlns:lc="http://schemas.openxmlformats.org/drawingml/2006/lockedCanvas" xmlns:dgm="http://schemas.openxmlformats.org/drawingml/2006/diagram" xmlns:wps="http://schemas.microsoft.com/office/word/2010/wordprocessingShape" xmlns:wpg="http://schemas.microsoft.com/office/word/2010/wordprocessingGroup" xmlns:w14="http://schemas.microsoft.com/office/word/2010/wordml" xmlns:w15="http://schemas.microsoft.com/office/word/2012/wordml" xmlns:w16="http://schemas.microsoft.com/office/word/2018/wordml" xmlns:w16cex="http://schemas.microsoft.com/office/word/2018/wordml/cex" xmlns:w16cid="http://schemas.microsoft.com/office/word/2016/wordml/cid" xmlns="http://schemas.microsoft.com/office/tasks/2019/documenttasks" xmlns:cr="http://schemas.microsoft.com/office/comments/2020/reactions">
   <w:docDefaults>
     <w:rPrDefault>
@@ -944,7 +791,7 @@
 </w:styles>
 </file>
 
-<file path=word\theme\theme1.xml><?xml version="1.0" encoding="utf-8"?>
+<file path=word/theme/theme1.xml><?xml version="1.0" encoding="utf-8"?>
 <a:theme xmlns:a="http://schemas.openxmlformats.org/drawingml/2006/main" name="Office Theme">
   <a:themeElements>
     <a:clrScheme name="Office">

</xml_diff>